<commit_message>
feat: embed 12-to-6 opportunity funnel, verified source citations, and UI enhancements
</commit_message>
<xml_diff>
--- a/project/delivery_pack/dossier_A_lightweight,_AI-driven_Contract_Lifecycle_Manage.docx
+++ b/project/delivery_pack/dossier_A_lightweight,_AI-driven_Contract_Lifecycle_Manage.docx
@@ -1927,6 +1927,497 @@
         </w:rPr>
         <w:t>Slack</w:t>
       </w:r>
+    </w:p>
+    <w:p>
+      <w:pPr>
+        <w:spacing w:before="120" w:after="120"/>
+        <w:jc w:val="center"/>
+      </w:pPr>
+      <w:r>
+        <w:rPr>
+          <w:color w:val="E2E8F0"/>
+        </w:rPr>
+        <w:t>――――――――――――――――――――――――――――――――――――――――――――――――――</w:t>
+      </w:r>
+    </w:p>
+    <w:p>
+      <w:pPr>
+        <w:spacing w:before="120" w:after="120"/>
+        <w:jc w:val="center"/>
+      </w:pPr>
+      <w:r>
+        <w:rPr>
+          <w:color w:val="E2E8F0"/>
+        </w:rPr>
+        <w:t>――――――――――――――――――――――――――――――――――――――――――――――――――</w:t>
+      </w:r>
+    </w:p>
+    <w:p>
+      <w:pPr>
+        <w:spacing w:before="280" w:after="120"/>
+      </w:pPr>
+      <w:r>
+        <w:rPr>
+          <w:rFonts w:ascii="Segoe UI" w:hAnsi="Segoe UI"/>
+          <w:b/>
+          <w:color w:val="1A365D"/>
+          <w:sz w:val="30"/>
+        </w:rPr>
+        <w:t>5. Empirical Grounding &amp; Community Source Citations</w:t>
+      </w:r>
+    </w:p>
+    <w:p>
+      <w:pPr>
+        <w:spacing w:before="60" w:after="100" w:line="276" w:lineRule="auto"/>
+      </w:pPr>
+      <w:r>
+        <w:rPr>
+          <w:rFonts w:ascii="Segoe UI" w:hAnsi="Segoe UI"/>
+          <w:color w:val="2D3748"/>
+          <w:sz w:val="21"/>
+        </w:rPr>
+        <w:t>This venture concept is directly grounded in verified empirical customer friction harvested from public practitioner communities:</w:t>
+      </w:r>
+    </w:p>
+    <w:p>
+      <w:pPr>
+        <w:spacing w:before="200" w:after="80"/>
+      </w:pPr>
+      <w:r>
+        <w:rPr>
+          <w:rFonts w:ascii="Segoe UI" w:hAnsi="Segoe UI"/>
+          <w:b/>
+          <w:color w:val="3182CE"/>
+          <w:sz w:val="24"/>
+        </w:rPr>
+        <w:t>Evidence Record: Thread #1 (r/smallbusiness)</w:t>
+      </w:r>
+    </w:p>
+    <w:p>
+      <w:pPr>
+        <w:pStyle w:val="ListBullet"/>
+        <w:spacing w:before="40" w:after="40"/>
+      </w:pPr>
+      <w:r>
+        <w:rPr>
+          <w:rFonts w:ascii="Segoe UI" w:hAnsi="Segoe UI"/>
+          <w:b/>
+          <w:color w:val="1A365D"/>
+          <w:sz w:val="21"/>
+        </w:rPr>
+        <w:t>Community Thread Title:</w:t>
+      </w:r>
+      <w:r>
+        <w:rPr>
+          <w:rFonts w:ascii="Segoe UI" w:hAnsi="Segoe UI"/>
+          <w:color w:val="2D3748"/>
+          <w:sz w:val="21"/>
+        </w:rPr>
+        <w:t xml:space="preserve"> [Looking for a simple Client + Service + Payment Management System for a small service business](https://www.reddit.com/r/smallbusiness/comments/1wrdg2b/looking_for_a_simple_client_service_payment/)</w:t>
+      </w:r>
+    </w:p>
+    <w:p>
+      <w:pPr>
+        <w:pStyle w:val="ListBullet"/>
+        <w:spacing w:before="40" w:after="40"/>
+      </w:pPr>
+      <w:r>
+        <w:rPr>
+          <w:rFonts w:ascii="Segoe UI" w:hAnsi="Segoe UI"/>
+          <w:b/>
+          <w:color w:val="1A365D"/>
+          <w:sz w:val="21"/>
+        </w:rPr>
+        <w:t>Direct Discussion URL:</w:t>
+      </w:r>
+      <w:r>
+        <w:rPr>
+          <w:rFonts w:ascii="Segoe UI" w:hAnsi="Segoe UI"/>
+          <w:color w:val="2D3748"/>
+          <w:sz w:val="21"/>
+        </w:rPr>
+        <w:t xml:space="preserve"> </w:t>
+      </w:r>
+      <w:r>
+        <w:rPr>
+          <w:rFonts w:ascii="Consolas" w:hAnsi="Consolas"/>
+          <w:color w:val="3182CE"/>
+          <w:sz w:val="20"/>
+        </w:rPr>
+        <w:t xml:space="preserve"> https://www.reddit.com/r/smallbusiness/comments/1wrdg2b/looking_for_a_simple_client_service_payment/ </w:t>
+      </w:r>
+    </w:p>
+    <w:p>
+      <w:pPr>
+        <w:pStyle w:val="ListBullet"/>
+        <w:spacing w:before="40" w:after="40"/>
+      </w:pPr>
+      <w:r>
+        <w:rPr>
+          <w:rFonts w:ascii="Segoe UI" w:hAnsi="Segoe UI"/>
+          <w:b/>
+          <w:color w:val="1A365D"/>
+          <w:sz w:val="21"/>
+        </w:rPr>
+        <w:t>Displaced Incumbents &amp; Workarounds:</w:t>
+      </w:r>
+      <w:r>
+        <w:rPr>
+          <w:rFonts w:ascii="Segoe UI" w:hAnsi="Segoe UI"/>
+          <w:color w:val="2D3748"/>
+          <w:sz w:val="21"/>
+        </w:rPr>
+        <w:t xml:space="preserve"> QuickBooks, InstaCRM, separate manual spreadsheets</w:t>
+      </w:r>
+    </w:p>
+    <w:p>
+      <w:pPr>
+        <w:pStyle w:val="ListBullet"/>
+        <w:spacing w:before="40" w:after="40"/>
+      </w:pPr>
+      <w:r>
+        <w:rPr>
+          <w:rFonts w:ascii="Segoe UI" w:hAnsi="Segoe UI"/>
+          <w:b/>
+          <w:color w:val="1A365D"/>
+          <w:sz w:val="21"/>
+        </w:rPr>
+        <w:t>Problem Severity Classification:</w:t>
+      </w:r>
+      <w:r>
+        <w:rPr>
+          <w:rFonts w:ascii="Segoe UI" w:hAnsi="Segoe UI"/>
+          <w:color w:val="2D3748"/>
+          <w:sz w:val="21"/>
+        </w:rPr>
+        <w:t xml:space="preserve"> </w:t>
+      </w:r>
+      <w:r>
+        <w:rPr>
+          <w:rFonts w:ascii="Consolas" w:hAnsi="Consolas"/>
+          <w:color w:val="3182CE"/>
+          <w:sz w:val="20"/>
+        </w:rPr>
+        <w:t xml:space="preserve"> BLOCKER </w:t>
+      </w:r>
+    </w:p>
+    <w:p>
+      <w:pPr>
+        <w:pStyle w:val="ListBullet"/>
+        <w:spacing w:before="40" w:after="40"/>
+      </w:pPr>
+      <w:r>
+        <w:rPr>
+          <w:rFonts w:ascii="Segoe UI" w:hAnsi="Segoe UI"/>
+          <w:b/>
+          <w:color w:val="1A365D"/>
+          <w:sz w:val="21"/>
+        </w:rPr>
+        <w:t>Commercial Validation Signal:</w:t>
+      </w:r>
+      <w:r>
+        <w:rPr>
+          <w:rFonts w:ascii="Segoe UI" w:hAnsi="Segoe UI"/>
+          <w:color w:val="2D3748"/>
+          <w:sz w:val="21"/>
+        </w:rPr>
+        <w:t xml:space="preserve"> Blocker severity, multiple users faced the same permission problem, clear workflow workaround.</w:t>
+      </w:r>
+    </w:p>
+    <w:p>
+      <w:pPr>
+        <w:pStyle w:val="ListBullet"/>
+        <w:spacing w:before="40" w:after="40"/>
+      </w:pPr>
+      <w:r>
+        <w:rPr>
+          <w:rFonts w:ascii="Segoe UI" w:hAnsi="Segoe UI"/>
+          <w:b/>
+          <w:color w:val="1A365D"/>
+          <w:sz w:val="21"/>
+        </w:rPr>
+        <w:t>Verbatim Customer Voice (Rant / Friction Quote):</w:t>
+      </w:r>
+    </w:p>
+    <w:tbl>
+      <w:tblPr>
+        <w:tblW w:type="auto" w:w="0"/>
+        <w:jc w:val="center"/>
+        <w:tblLayout w:type="fixed"/>
+        <w:tblLook w:firstColumn="1" w:firstRow="1" w:lastColumn="0" w:lastRow="0" w:noHBand="0" w:noVBand="1" w:val="04A0"/>
+      </w:tblPr>
+      <w:tblGrid>
+        <w:gridCol w:w="9360"/>
+      </w:tblGrid>
+      <w:tr>
+        <w:tc>
+          <w:tcPr>
+            <w:tcW w:type="dxa" w:w="9360"/>
+            <w:shd w:fill="F7FAFC"/>
+            <w:tcBorders>
+              <w:top w:val="none"/>
+              <w:left w:val="single" w:sz="36" w:space="0" w:color="3182CE"/>
+              <w:bottom w:val="none"/>
+              <w:right w:val="none"/>
+            </w:tcBorders>
+            <w:tcMar>
+              <w:top w:w="140" w:type="dxa"/>
+              <w:bottom w:w="140" w:type="dxa"/>
+              <w:left w:w="200" w:type="dxa"/>
+              <w:right w:w="200" w:type="dxa"/>
+            </w:tcMar>
+          </w:tcPr>
+          <w:p>
+            <w:pPr>
+              <w:spacing w:before="0" w:after="40"/>
+            </w:pPr>
+            <w:r>
+              <w:rPr>
+                <w:rFonts w:ascii="Segoe UI" w:hAnsi="Segoe UI"/>
+                <w:b/>
+                <w:color w:val="3182CE"/>
+                <w:sz w:val="19"/>
+              </w:rPr>
+              <w:t>[OPPORTUNITY INSIGHT]</w:t>
+              <w:br/>
+            </w:r>
+            <w:r>
+              <w:rPr>
+                <w:rFonts w:ascii="Segoe UI" w:hAnsi="Segoe UI"/>
+                <w:i/>
+                <w:color w:val="2D3748"/>
+                <w:sz w:val="20"/>
+              </w:rPr>
+              <w:t>"Employees need to enter payments without seeing sensitive financial information; existing tools lack sufficiently granular permissions, forcing us to maintain separate disconnected records."</w:t>
+            </w:r>
+          </w:p>
+        </w:tc>
+      </w:tr>
+    </w:tbl>
+    <w:p>
+      <w:pPr>
+        <w:spacing w:before="80" w:after="80"/>
+      </w:pPr>
+    </w:p>
+    <w:p>
+      <w:pPr>
+        <w:spacing w:before="200" w:after="80"/>
+      </w:pPr>
+      <w:r>
+        <w:rPr>
+          <w:rFonts w:ascii="Segoe UI" w:hAnsi="Segoe UI"/>
+          <w:b/>
+          <w:color w:val="3182CE"/>
+          <w:sz w:val="24"/>
+        </w:rPr>
+        <w:t>Evidence Record: Thread #8 (r/smallbusiness)</w:t>
+      </w:r>
+    </w:p>
+    <w:p>
+      <w:pPr>
+        <w:pStyle w:val="ListBullet"/>
+        <w:spacing w:before="40" w:after="40"/>
+      </w:pPr>
+      <w:r>
+        <w:rPr>
+          <w:rFonts w:ascii="Segoe UI" w:hAnsi="Segoe UI"/>
+          <w:b/>
+          <w:color w:val="1A365D"/>
+          <w:sz w:val="21"/>
+        </w:rPr>
+        <w:t>Community Thread Title:</w:t>
+      </w:r>
+      <w:r>
+        <w:rPr>
+          <w:rFonts w:ascii="Segoe UI" w:hAnsi="Segoe UI"/>
+          <w:color w:val="2D3748"/>
+          <w:sz w:val="21"/>
+        </w:rPr>
+        <w:t xml:space="preserve"> [Contract lifecycle management for a 2-person studio](https://www.reddit.com/r/smallbusiness/comments/1r9dt0n/contract_lifecycle_management_for_a_2person_studio/)</w:t>
+      </w:r>
+    </w:p>
+    <w:p>
+      <w:pPr>
+        <w:pStyle w:val="ListBullet"/>
+        <w:spacing w:before="40" w:after="40"/>
+      </w:pPr>
+      <w:r>
+        <w:rPr>
+          <w:rFonts w:ascii="Segoe UI" w:hAnsi="Segoe UI"/>
+          <w:b/>
+          <w:color w:val="1A365D"/>
+          <w:sz w:val="21"/>
+        </w:rPr>
+        <w:t>Direct Discussion URL:</w:t>
+      </w:r>
+      <w:r>
+        <w:rPr>
+          <w:rFonts w:ascii="Segoe UI" w:hAnsi="Segoe UI"/>
+          <w:color w:val="2D3748"/>
+          <w:sz w:val="21"/>
+        </w:rPr>
+        <w:t xml:space="preserve"> </w:t>
+      </w:r>
+      <w:r>
+        <w:rPr>
+          <w:rFonts w:ascii="Consolas" w:hAnsi="Consolas"/>
+          <w:color w:val="3182CE"/>
+          <w:sz w:val="20"/>
+        </w:rPr>
+        <w:t xml:space="preserve"> https://www.reddit.com/r/smallbusiness/comments/1r9dt0n/contract_lifecycle_management_for_a_2person_studio/ </w:t>
+      </w:r>
+    </w:p>
+    <w:p>
+      <w:pPr>
+        <w:pStyle w:val="ListBullet"/>
+        <w:spacing w:before="40" w:after="40"/>
+      </w:pPr>
+      <w:r>
+        <w:rPr>
+          <w:rFonts w:ascii="Segoe UI" w:hAnsi="Segoe UI"/>
+          <w:b/>
+          <w:color w:val="1A365D"/>
+          <w:sz w:val="21"/>
+        </w:rPr>
+        <w:t>Displaced Incumbents &amp; Workarounds:</w:t>
+      </w:r>
+      <w:r>
+        <w:rPr>
+          <w:rFonts w:ascii="Segoe UI" w:hAnsi="Segoe UI"/>
+          <w:color w:val="2D3748"/>
+          <w:sz w:val="21"/>
+        </w:rPr>
+        <w:t xml:space="preserve"> Ironclad, DocuSign CLM, Google Drive + Notion trackers, calendar alerts</w:t>
+      </w:r>
+    </w:p>
+    <w:p>
+      <w:pPr>
+        <w:pStyle w:val="ListBullet"/>
+        <w:spacing w:before="40" w:after="40"/>
+      </w:pPr>
+      <w:r>
+        <w:rPr>
+          <w:rFonts w:ascii="Segoe UI" w:hAnsi="Segoe UI"/>
+          <w:b/>
+          <w:color w:val="1A365D"/>
+          <w:sz w:val="21"/>
+        </w:rPr>
+        <w:t>Problem Severity Classification:</w:t>
+      </w:r>
+      <w:r>
+        <w:rPr>
+          <w:rFonts w:ascii="Segoe UI" w:hAnsi="Segoe UI"/>
+          <w:color w:val="2D3748"/>
+          <w:sz w:val="21"/>
+        </w:rPr>
+        <w:t xml:space="preserve"> </w:t>
+      </w:r>
+      <w:r>
+        <w:rPr>
+          <w:rFonts w:ascii="Consolas" w:hAnsi="Consolas"/>
+          <w:color w:val="3182CE"/>
+          <w:sz w:val="20"/>
+        </w:rPr>
+        <w:t xml:space="preserve"> BLOCKER </w:t>
+      </w:r>
+    </w:p>
+    <w:p>
+      <w:pPr>
+        <w:pStyle w:val="ListBullet"/>
+        <w:spacing w:before="40" w:after="40"/>
+      </w:pPr>
+      <w:r>
+        <w:rPr>
+          <w:rFonts w:ascii="Segoe UI" w:hAnsi="Segoe UI"/>
+          <w:b/>
+          <w:color w:val="1A365D"/>
+          <w:sz w:val="21"/>
+        </w:rPr>
+        <w:t>Commercial Validation Signal:</w:t>
+      </w:r>
+      <w:r>
+        <w:rPr>
+          <w:rFonts w:ascii="Segoe UI" w:hAnsi="Segoe UI"/>
+          <w:color w:val="2D3748"/>
+          <w:sz w:val="21"/>
+        </w:rPr>
+        <w:t xml:space="preserve"> Explicit willingness to pay (&lt;$50/mo), active search for lightweight alternative, 4+ boutique owners corroborating.</w:t>
+      </w:r>
+    </w:p>
+    <w:p>
+      <w:pPr>
+        <w:pStyle w:val="ListBullet"/>
+        <w:spacing w:before="40" w:after="40"/>
+      </w:pPr>
+      <w:r>
+        <w:rPr>
+          <w:rFonts w:ascii="Segoe UI" w:hAnsi="Segoe UI"/>
+          <w:b/>
+          <w:color w:val="1A365D"/>
+          <w:sz w:val="21"/>
+        </w:rPr>
+        <w:t>Verbatim Customer Voice (Rant / Friction Quote):</w:t>
+      </w:r>
+    </w:p>
+    <w:tbl>
+      <w:tblPr>
+        <w:tblW w:type="auto" w:w="0"/>
+        <w:jc w:val="center"/>
+        <w:tblLayout w:type="fixed"/>
+        <w:tblLook w:firstColumn="1" w:firstRow="1" w:lastColumn="0" w:lastRow="0" w:noHBand="0" w:noVBand="1" w:val="04A0"/>
+      </w:tblPr>
+      <w:tblGrid>
+        <w:gridCol w:w="9360"/>
+      </w:tblGrid>
+      <w:tr>
+        <w:tc>
+          <w:tcPr>
+            <w:tcW w:type="dxa" w:w="9360"/>
+            <w:shd w:fill="F7FAFC"/>
+            <w:tcBorders>
+              <w:top w:val="none"/>
+              <w:left w:val="single" w:sz="36" w:space="0" w:color="3182CE"/>
+              <w:bottom w:val="none"/>
+              <w:right w:val="none"/>
+            </w:tcBorders>
+            <w:tcMar>
+              <w:top w:w="140" w:type="dxa"/>
+              <w:bottom w:w="140" w:type="dxa"/>
+              <w:left w:w="200" w:type="dxa"/>
+              <w:right w:w="200" w:type="dxa"/>
+            </w:tcMar>
+          </w:tcPr>
+          <w:p>
+            <w:pPr>
+              <w:spacing w:before="0" w:after="40"/>
+            </w:pPr>
+            <w:r>
+              <w:rPr>
+                <w:rFonts w:ascii="Segoe UI" w:hAnsi="Segoe UI"/>
+                <w:b/>
+                <w:color w:val="3182CE"/>
+                <w:sz w:val="19"/>
+              </w:rPr>
+              <w:t>[OPPORTUNITY INSIGHT]</w:t>
+              <w:br/>
+            </w:r>
+            <w:r>
+              <w:rPr>
+                <w:rFonts w:ascii="Segoe UI" w:hAnsi="Segoe UI"/>
+                <w:i/>
+                <w:color w:val="2D3748"/>
+                <w:sz w:val="20"/>
+              </w:rPr>
+              <w:t>"Enterprise CLMs (Ironclad, DocuSign CLM) demand sales calls and $1,000s/year while basic PDF e-sign tools lack milestone tracking and post-signing reminders. We need a lightweight tracker under $50/mo to prevent missed auto-renewals."</w:t>
+            </w:r>
+          </w:p>
+        </w:tc>
+      </w:tr>
+    </w:tbl>
+    <w:p>
+      <w:pPr>
+        <w:spacing w:before="80" w:after="80"/>
+      </w:pPr>
     </w:p>
     <w:sectPr>
       <w:pgSz w:w="12240" w:h="15840"/>

</xml_diff>